<commit_message>
fix: change template placeholders from {{tag}} to {tag} for docxtemplater compatibility
</commit_message>
<xml_diff>
--- a/public/templates/template_spm.docx
+++ b/public/templates/template_spm.docx
@@ -31,7 +31,7 @@
           <w:sz w:val="20"/>
           <w:szCs w:val="20"/>
         </w:rPr>
-        <w:t xml:space="preserve">Nomor : {{nomor_surat}}</w:t>
+        <w:t xml:space="preserve">Nomor : {nomor_surat}</w:t>
       </w:r>
     </w:p>
     <w:p>
@@ -63,7 +63,7 @@
           <w:sz w:val="20"/>
           <w:szCs w:val="20"/>
         </w:rPr>
-        <w:t xml:space="preserve">{{hari_surat}}</w:t>
+        <w:t xml:space="preserve">{hari_surat}</w:t>
       </w:r>
       <w:r>
         <w:rPr>
@@ -81,7 +81,7 @@
           <w:sz w:val="20"/>
           <w:szCs w:val="20"/>
         </w:rPr>
-        <w:t xml:space="preserve">{{tanggal_surat_terbilang}}</w:t>
+        <w:t xml:space="preserve">{tanggal_surat_terbilang}</w:t>
       </w:r>
       <w:r>
         <w:rPr>
@@ -99,7 +99,7 @@
           <w:sz w:val="20"/>
           <w:szCs w:val="20"/>
         </w:rPr>
-        <w:t xml:space="preserve">{{bulan_surat}}</w:t>
+        <w:t xml:space="preserve">{bulan_surat}</w:t>
       </w:r>
       <w:r>
         <w:rPr>
@@ -117,7 +117,7 @@
           <w:sz w:val="20"/>
           <w:szCs w:val="20"/>
         </w:rPr>
-        <w:t xml:space="preserve">{{tahun_surat_terbilang}}</w:t>
+        <w:t xml:space="preserve">{tahun_surat_terbilang}</w:t>
       </w:r>
       <w:r>
         <w:rPr>
@@ -175,15 +175,15 @@
           <w:sz w:val="20"/>
           <w:szCs w:val="20"/>
         </w:rPr>
-        <w:t xml:space="preserve">{{pihak_pertama_nama}}</w:t>
-      </w:r>
-      <w:r>
-        <w:rPr>
-          <w:rFonts w:ascii="Arial" w:cs="Arial" w:eastAsia="Arial" w:hAnsi="Arial"/>
-          <w:sz w:val="20"/>
-          <w:szCs w:val="20"/>
-        </w:rPr>
-        <w:t xml:space="preserve">, selaku {{pihak_pertama_jabatan}} untuk dan atas nama PT Prima Layanan Nasional Enjiniring, berkedudukan di Jl. Aipda KS Tubun I No.2 Jakarta 11420, yang selanjutnya disebut sebagai </w:t>
+        <w:t xml:space="preserve">{pihak_pertama_nama}</w:t>
+      </w:r>
+      <w:r>
+        <w:rPr>
+          <w:rFonts w:ascii="Arial" w:cs="Arial" w:eastAsia="Arial" w:hAnsi="Arial"/>
+          <w:sz w:val="20"/>
+          <w:szCs w:val="20"/>
+        </w:rPr>
+        <w:t xml:space="preserve">, selaku {pihak_pertama_jabatan} untuk dan atas nama PT Prima Layanan Nasional Enjiniring, berkedudukan di Jl. Aipda KS Tubun I No.2 Jakarta 11420, yang selanjutnya disebut sebagai </w:t>
       </w:r>
       <w:r>
         <w:rPr>
@@ -233,15 +233,15 @@
           <w:sz w:val="20"/>
           <w:szCs w:val="20"/>
         </w:rPr>
-        <w:t xml:space="preserve">{{nama_intern}}</w:t>
-      </w:r>
-      <w:r>
-        <w:rPr>
-          <w:rFonts w:ascii="Arial" w:cs="Arial" w:eastAsia="Arial" w:hAnsi="Arial"/>
-          <w:sz w:val="20"/>
-          <w:szCs w:val="20"/>
-        </w:rPr>
-        <w:t xml:space="preserve">, Pemegang identitas KTP Nomor {{nik_intern}}, {{jenis_kelamin}}, beralamat {{alamat_intern}}, dalam hal ini bertindak untuk dan atas nama sendiri yang selanjutnya dalam perjanjian ini disebut sebagai </w:t>
+        <w:t xml:space="preserve">{nama_intern}</w:t>
+      </w:r>
+      <w:r>
+        <w:rPr>
+          <w:rFonts w:ascii="Arial" w:cs="Arial" w:eastAsia="Arial" w:hAnsi="Arial"/>
+          <w:sz w:val="20"/>
+          <w:szCs w:val="20"/>
+        </w:rPr>
+        <w:t xml:space="preserve">, Pemegang identitas KTP Nomor {nik_intern}, {jenis_kelamin}, beralamat {alamat_intern}, dalam hal ini bertindak untuk dan atas nama sendiri yang selanjutnya dalam perjanjian ini disebut sebagai </w:t>
       </w:r>
       <w:r>
         <w:rPr>
@@ -469,7 +469,7 @@
           <w:sz w:val="20"/>
           <w:szCs w:val="20"/>
         </w:rPr>
-        <w:t xml:space="preserve"> bersedia Magang untuk memperoleh pengalaman dalam Bidang {{bidang_magang}} di PT PLN Enjiniring.</w:t>
+        <w:t xml:space="preserve"> bersedia Magang untuk memperoleh pengalaman dalam Bidang {bidang_magang} di PT PLN Enjiniring.</w:t>
       </w:r>
     </w:p>
     <w:p>
@@ -1131,7 +1131,7 @@
           <w:sz w:val="20"/>
           <w:szCs w:val="20"/>
         </w:rPr>
-        <w:t xml:space="preserve">{{jangka_waktu}}</w:t>
+        <w:t xml:space="preserve">{jangka_waktu}</w:t>
       </w:r>
       <w:r>
         <w:rPr>
@@ -1300,7 +1300,7 @@
           <w:sz w:val="20"/>
           <w:szCs w:val="20"/>
         </w:rPr>
-        <w:t xml:space="preserve">{{uang_saku}}</w:t>
+        <w:t xml:space="preserve">{uang_saku}</w:t>
       </w:r>
       <w:r>
         <w:rPr>
@@ -2288,7 +2288,7 @@
                 <w:sz w:val="20"/>
                 <w:szCs w:val="20"/>
               </w:rPr>
-              <w:t xml:space="preserve">{{nama_intern}}</w:t>
+              <w:t xml:space="preserve">{nama_intern}</w:t>
             </w:r>
           </w:p>
         </w:tc>
@@ -2305,7 +2305,7 @@
                 <w:sz w:val="20"/>
                 <w:szCs w:val="20"/>
               </w:rPr>
-              <w:t xml:space="preserve">{{pihak_pertama_nama}}</w:t>
+              <w:t xml:space="preserve">{pihak_pertama_nama}</w:t>
             </w:r>
           </w:p>
         </w:tc>

</xml_diff>